<commit_message>
Main challenges: add open-source software (text item 7, 249 words; diagram panel and main aim)
Co-Authored-By: Claude Opus 5.5 <noreply@anthropic.com>
Claude-Session: https://claude.ai/code/session_016Cdcj2FTAQGBVsJUyYJR2M
</commit_message>
<xml_diff>
--- a/docs/research_notes/Main_Challenges_Arial11.docx
+++ b/docs/research_notes/Main_Challenges_Arial11.docx
@@ -29,7 +29,7 @@
           <w:rFonts w:ascii="Arial" w:hAnsi="Arial"/>
           <w:sz w:val="22"/>
         </w:rPr>
-        <w:t>Record-shattering droughts and intense rainfall push the aquifer into states the monitoring record never contained; in our tests, an alarm built on the record alone failed after the pumping decision in 9 of 20 aquifers.</w:t>
+        <w:t>Record-breaking droughts and intense rainfall push the aquifer into states the record never contained; in our tests, a record-only alarm failed after the pumping decision in 9 of 20 aquifers.</w:t>
       </w:r>
     </w:p>
     <w:p>
@@ -49,7 +49,7 @@
           <w:rFonts w:ascii="Arial" w:hAnsi="Arial"/>
           <w:sz w:val="22"/>
         </w:rPr>
-        <w:t>Unregistered private wells pump more in a drought. This changes the causal mechanism, is not seen in the recorded rainfall and pumping data, and must therefore be bounded rather than estimated.</w:t>
+        <w:t>Unregistered private wells pump more in a drought; this changes the causal mechanism, is invisible in the records and must be bounded rather than estimated.</w:t>
       </w:r>
     </w:p>
     <w:p>
@@ -69,7 +69,7 @@
           <w:rFonts w:ascii="Arial" w:hAnsi="Arial"/>
           <w:sz w:val="22"/>
         </w:rPr>
-        <w:t>Density-driven flow, salt memory in clay and silt layers and ion exchange act over decades, yet every decision must be checked over many storylines and weather sequences; this needs a coupled Newton solver, an exact adjoint and goal-oriented simplification.</w:t>
+        <w:t>Density-driven flow, salt memory in clay layers and ion exchange act over decades, yet every decision must be checked over many storylines; this needs a coupled Newton solver, an exact adjoint and goal-oriented simplification.</w:t>
       </w:r>
     </w:p>
     <w:p>
@@ -89,7 +89,7 @@
           <w:rFonts w:ascii="Arial" w:hAnsi="Arial"/>
           <w:sz w:val="22"/>
         </w:rPr>
-        <w:t>Chloride is sampled at few wells and rarely, piezometers are few, and sea level and recharge are uncertain; deciding where and when to sample is part of the problem.</w:t>
+        <w:t>Chloride is sampled rarely at few wells, piezometers are few, and sea level and recharge are uncertain; where and when to sample is part of the problem.</w:t>
       </w:r>
     </w:p>
     <w:p>
@@ -109,7 +109,7 @@
           <w:rFonts w:ascii="Arial" w:hAnsi="Arial"/>
           <w:sz w:val="22"/>
         </w:rPr>
-        <w:t>Stakeholders must agree on the acceptable share of seasons above 250 mg/L, on who gives up water, the utility or the farmers, and on the rules that trigger pumping cuts. The trade-off is sharp: the safest tested rule delivers 71% of the planned water in the worst storyline.</w:t>
+        <w:t>Stakeholders must agree on the acceptable share of seasons above 250 mg/L, on who gives up water, utility or farmers, and on the rules that trigger pumping cuts; the safest tested rule delivers 71% of the planned water in the worst storyline.</w:t>
       </w:r>
     </w:p>
     <w:p>
@@ -129,7 +129,27 @@
           <w:rFonts w:ascii="Arial" w:hAnsi="Arial"/>
           <w:sz w:val="22"/>
         </w:rPr>
-        <w:t>Results come from synthetic aquifers on a 2-D section; they must be confirmed with Fushë-Kuqe field data, extended to 3-D and transferred to other coastal and karst aquifers.</w:t>
+        <w:t>Results from synthetic 2-D aquifers must be confirmed with Fushë-Kuqe field data, extended to 3-D and transferred to other coastal and karst aquifers.</w:t>
+      </w:r>
+    </w:p>
+    <w:p>
+      <w:pPr>
+        <w:spacing w:after="80"/>
+      </w:pPr>
+      <w:r>
+        <w:rPr>
+          <w:rFonts w:ascii="Arial" w:hAnsi="Arial"/>
+          <w:b/>
+          <w:sz w:val="22"/>
+        </w:rPr>
+        <w:t xml:space="preserve">7. Open-source software. </w:t>
+      </w:r>
+      <w:r>
+        <w:rPr>
+          <w:rFonts w:ascii="Arial" w:hAnsi="Arial"/>
+          <w:sz w:val="22"/>
+        </w:rPr>
+        <w:t>No open tool lets an authority or utility run these checks itself; members contribute code, and missions and Training Schools assemble it into one documented open-source workflow whose minimal version needs no adjoint solver or geochemical model.</w:t>
       </w:r>
     </w:p>
     <w:sectPr>

</xml_diff>